<commit_message>
Komplet rev6: zaliczka 50%, wniosek do UDT do 31.12.2026 i 60 dni na dokument dopuszczający
Co-Authored-By: Claude Sonnet 5.5 <noreply@anthropic.com>
Claude-Session: https://claude.ai/code/session_014oD5P5yiRwT6Zb7b7udEcr
</commit_message>
<xml_diff>
--- a/komplet_zapytanie_nr1_rev6/0_Zapytanie_ofertowe_nr1_rev6_zmiany_sledzone.docx
+++ b/komplet_zapytanie_nr1_rev6/0_Zapytanie_ofertowe_nr1_rev6_zmiany_sledzone.docx
@@ -4269,7 +4269,7 @@
           <w:szCs w:val="22"/>
         </w:rPr>
       </w:pPr>
-      <w:del w:id="5007" w:author="Ewa Retajczyk" w:date="2026-10-20T16:04:42Z">
+      <w:del w:id="5007" w:author="Ewa Retajczyk" w:date="2026-10-20T16:04:41Z">
         <w:r>
           <w:rPr>
             <w:rFonts w:cstheme="minorHAnsi"/>
@@ -4289,13 +4289,13 @@
         <w:spacing w:after="0" w:line="276" w:lineRule="auto"/>
         <w:jc w:val="both"/>
         <w:rPr>
-          <w:del w:id="5010" w:author="Ewa Retajczyk" w:date="2026-10-20T16:04:43Z"/>
-          <w:rFonts w:cstheme="minorHAnsi"/>
-          <w:sz w:val="22"/>
-          <w:szCs w:val="22"/>
-        </w:rPr>
-      </w:pPr>
-      <w:del w:id="5009" w:author="Ewa Retajczyk" w:date="2026-10-20T16:04:57Z">
+          <w:del w:id="5010" w:author="Ewa Retajczyk" w:date="2026-10-20T16:04:42Z"/>
+          <w:rFonts w:cstheme="minorHAnsi"/>
+          <w:sz w:val="22"/>
+          <w:szCs w:val="22"/>
+        </w:rPr>
+      </w:pPr>
+      <w:del w:id="5009" w:author="Ewa Retajczyk" w:date="2026-10-20T16:04:43Z">
         <w:r>
           <w:rPr>
             <w:rFonts w:cstheme="minorHAnsi"/>
@@ -4781,7 +4781,7 @@
         </w:rPr>
         <w:t xml:space="preserve">Wykonawca zapewni wsparcie techniczne podczas odbiorów oraz badań UDT dotyczących jego zakresu, tj. Zamówienia nr 1. Każda z 6 stacji ładowania wymaga odrębnej dokumentacji do badania UDT i odrębnej tabliczki znamionowej.</w:t>
       </w:r>
-      <w:ins w:id="5013" w:author="Ewa Retajczyk" w:date="2026-10-20T16:05:46Z">
+      <w:ins w:id="5013" w:author="Ewa Retajczyk" w:date="2026-10-20T16:04:57Z">
         <w:r>
           <w:rPr>
             <w:rFonts w:cstheme="minorHAnsi"/>
@@ -7732,7 +7732,7 @@
           <w:szCs w:val="22"/>
         </w:rPr>
       </w:pPr>
-      <w:ins w:id="5028" w:author="Ewa Retajczyk" w:date="2026-10-20T16:06:02Z">
+      <w:ins w:id="5028" w:author="Ewa Retajczyk" w:date="2026-10-20T16:05:46Z">
         <w:r>
           <w:rPr>
             <w:rFonts w:cstheme="minorHAnsi"/>
@@ -7750,7 +7750,7 @@
         </w:rPr>
         <w:t xml:space="preserve">Wykonawca </w:t>
       </w:r>
-      <w:del w:id="5029" w:author="Ewa Retajczyk" w:date="2026-10-20T16:06:04Z">
+      <w:del w:id="5029" w:author="Ewa Retajczyk" w:date="2026-10-20T16:06:02Z">
         <w:r>
           <w:rPr>
             <w:rFonts w:cstheme="minorHAnsi"/>
@@ -7760,7 +7760,7 @@
           <w:delText xml:space="preserve">określi:</w:delText>
         </w:r>
       </w:del>
-      <w:ins w:id="5030" w:author="Ewa Retajczyk" w:date="2026-10-20T16:07:13Z">
+      <w:ins w:id="5030" w:author="Ewa Retajczyk" w:date="2026-10-20T16:06:04Z">
         <w:r>
           <w:rPr>
             <w:rFonts w:cstheme="minorHAnsi"/>
@@ -7780,13 +7780,13 @@
         <w:spacing w:after="0" w:line="276" w:lineRule="auto"/>
         <w:jc w:val="both"/>
         <w:rPr>
-          <w:del w:id="5015" w:author="Ewa Retajczyk" w:date="2026-10-20T16:08:14Z"/>
-          <w:rFonts w:cstheme="minorHAnsi"/>
-          <w:sz w:val="22"/>
-          <w:szCs w:val="22"/>
-        </w:rPr>
-      </w:pPr>
-      <w:del w:id="5014" w:author="Ewa Retajczyk" w:date="2026-10-20T16:08:55Z">
+          <w:del w:id="5015" w:author="Ewa Retajczyk" w:date="2026-10-20T16:06:43Z"/>
+          <w:rFonts w:cstheme="minorHAnsi"/>
+          <w:sz w:val="22"/>
+          <w:szCs w:val="22"/>
+        </w:rPr>
+      </w:pPr>
+      <w:del w:id="5014" w:author="Ewa Retajczyk" w:date="2026-10-20T16:07:13Z">
         <w:r>
           <w:rPr>
             <w:rFonts w:cstheme="minorHAnsi"/>
@@ -7806,13 +7806,13 @@
         <w:spacing w:after="0" w:line="276" w:lineRule="auto"/>
         <w:jc w:val="both"/>
         <w:rPr>
-          <w:del w:id="5017" w:author="Ewa Retajczyk" w:date="2026-10-20T16:09:45Z"/>
-          <w:rFonts w:cstheme="minorHAnsi"/>
-          <w:sz w:val="22"/>
-          <w:szCs w:val="22"/>
-        </w:rPr>
-      </w:pPr>
-      <w:del w:id="5016" w:author="Ewa Retajczyk" w:date="2026-10-20T16:11:23Z">
+          <w:del w:id="5017" w:author="Ewa Retajczyk" w:date="2026-10-20T16:08:14Z"/>
+          <w:rFonts w:cstheme="minorHAnsi"/>
+          <w:sz w:val="22"/>
+          <w:szCs w:val="22"/>
+        </w:rPr>
+      </w:pPr>
+      <w:del w:id="5016" w:author="Ewa Retajczyk" w:date="2026-10-20T16:08:55Z">
         <w:r>
           <w:rPr>
             <w:rFonts w:cstheme="minorHAnsi"/>
@@ -7832,13 +7832,13 @@
         <w:spacing w:after="0" w:line="276" w:lineRule="auto"/>
         <w:jc w:val="both"/>
         <w:rPr>
-          <w:del w:id="5019" w:author="Ewa Retajczyk" w:date="2026-10-20T16:11:31Z"/>
-          <w:rFonts w:cstheme="minorHAnsi"/>
-          <w:sz w:val="22"/>
-          <w:szCs w:val="22"/>
-        </w:rPr>
-      </w:pPr>
-      <w:del w:id="5018" w:author="Ewa Retajczyk" w:date="2026-10-20T16:11:35Z">
+          <w:del w:id="5019" w:author="Ewa Retajczyk" w:date="2026-10-20T16:09:45Z"/>
+          <w:rFonts w:cstheme="minorHAnsi"/>
+          <w:sz w:val="22"/>
+          <w:szCs w:val="22"/>
+        </w:rPr>
+      </w:pPr>
+      <w:del w:id="5018" w:author="Ewa Retajczyk" w:date="2026-10-20T16:11:23Z">
         <w:r>
           <w:rPr>
             <w:rFonts w:cstheme="minorHAnsi"/>
@@ -7858,13 +7858,13 @@
         <w:spacing w:after="0" w:line="276" w:lineRule="auto"/>
         <w:jc w:val="both"/>
         <w:rPr>
-          <w:del w:id="5021" w:author="Ewa Retajczyk" w:date="2026-10-20T16:11:59Z"/>
-          <w:rFonts w:cstheme="minorHAnsi"/>
-          <w:sz w:val="22"/>
-          <w:szCs w:val="22"/>
-        </w:rPr>
-      </w:pPr>
-      <w:del w:id="5020" w:author="Ewa Retajczyk" w:date="2026-10-20T16:12:20Z">
+          <w:del w:id="5021" w:author="Ewa Retajczyk" w:date="2026-10-20T16:11:31Z"/>
+          <w:rFonts w:cstheme="minorHAnsi"/>
+          <w:sz w:val="22"/>
+          <w:szCs w:val="22"/>
+        </w:rPr>
+      </w:pPr>
+      <w:del w:id="5020" w:author="Ewa Retajczyk" w:date="2026-10-20T16:11:35Z">
         <w:r>
           <w:rPr>
             <w:rFonts w:cstheme="minorHAnsi"/>
@@ -7884,13 +7884,13 @@
         <w:spacing w:after="0" w:line="276" w:lineRule="auto"/>
         <w:jc w:val="both"/>
         <w:rPr>
-          <w:del w:id="5023" w:author="Ewa Retajczyk" w:date="2026-10-20T16:12:32Z"/>
-          <w:rFonts w:cstheme="minorHAnsi"/>
-          <w:sz w:val="22"/>
-          <w:szCs w:val="22"/>
-        </w:rPr>
-      </w:pPr>
-      <w:del w:id="5022" w:author="Ewa Retajczyk" w:date="2026-10-20T16:12:33Z">
+          <w:del w:id="5023" w:author="Ewa Retajczyk" w:date="2026-10-20T16:11:59Z"/>
+          <w:rFonts w:cstheme="minorHAnsi"/>
+          <w:sz w:val="22"/>
+          <w:szCs w:val="22"/>
+        </w:rPr>
+      </w:pPr>
+      <w:del w:id="5022" w:author="Ewa Retajczyk" w:date="2026-10-20T16:12:20Z">
         <w:r>
           <w:rPr>
             <w:rFonts w:cstheme="minorHAnsi"/>
@@ -7910,13 +7910,13 @@
         <w:spacing w:after="0" w:line="276" w:lineRule="auto"/>
         <w:jc w:val="both"/>
         <w:rPr>
-          <w:del w:id="5025" w:author="Ewa Retajczyk" w:date="2026-10-20T16:12:57Z"/>
-          <w:rFonts w:cstheme="minorHAnsi"/>
-          <w:sz w:val="22"/>
-          <w:szCs w:val="22"/>
-        </w:rPr>
-      </w:pPr>
-      <w:del w:id="5024" w:author="Ewa Retajczyk" w:date="2026-10-20T16:14:37Z">
+          <w:del w:id="5025" w:author="Ewa Retajczyk" w:date="2026-10-20T16:12:32Z"/>
+          <w:rFonts w:cstheme="minorHAnsi"/>
+          <w:sz w:val="22"/>
+          <w:szCs w:val="22"/>
+        </w:rPr>
+      </w:pPr>
+      <w:del w:id="5024" w:author="Ewa Retajczyk" w:date="2026-10-20T16:12:33Z">
         <w:r>
           <w:rPr>
             <w:rFonts w:cstheme="minorHAnsi"/>
@@ -7936,13 +7936,13 @@
         <w:spacing w:after="0" w:line="276" w:lineRule="auto"/>
         <w:jc w:val="both"/>
         <w:rPr>
-          <w:del w:id="5027" w:author="Ewa Retajczyk" w:date="2026-10-20T16:14:53Z"/>
-          <w:rFonts w:cstheme="minorHAnsi"/>
-          <w:sz w:val="22"/>
-          <w:szCs w:val="22"/>
-        </w:rPr>
-      </w:pPr>
-      <w:del w:id="5026" w:author="Ewa Retajczyk" w:date="2026-10-20T16:15:25Z">
+          <w:del w:id="5027" w:author="Ewa Retajczyk" w:date="2026-10-20T16:12:57Z"/>
+          <w:rFonts w:cstheme="minorHAnsi"/>
+          <w:sz w:val="22"/>
+          <w:szCs w:val="22"/>
+        </w:rPr>
+      </w:pPr>
+      <w:del w:id="5026" w:author="Ewa Retajczyk" w:date="2026-10-20T16:14:37Z">
         <w:r>
           <w:rPr>
             <w:rFonts w:cstheme="minorHAnsi"/>
@@ -8051,7 +8051,7 @@
         </w:rPr>
         <w:t xml:space="preserve">Wykonawca poda</w:t>
       </w:r>
-      <w:del w:id="5047" w:author="Ewa Retajczyk" w:date="2026-10-20T16:15:52Z">
+      <w:del w:id="5047" w:author="Ewa Retajczyk" w:date="2026-10-20T16:14:53Z">
         <w:r>
           <w:rPr>
             <w:rFonts w:cstheme="minorHAnsi"/>
@@ -8061,7 +8061,7 @@
           <w:delText xml:space="preserve">:</w:delText>
         </w:r>
       </w:del>
-      <w:ins w:id="5048" w:author="Ewa Retajczyk" w:date="2026-10-20T16:16:43Z">
+      <w:ins w:id="5048" w:author="Ewa Retajczyk" w:date="2026-10-20T16:15:25Z">
         <w:r>
           <w:rPr>
             <w:rFonts w:cstheme="minorHAnsi"/>
@@ -8081,13 +8081,13 @@
         <w:spacing w:after="0" w:line="276" w:lineRule="auto"/>
         <w:jc w:val="both"/>
         <w:rPr>
-          <w:del w:id="5032" w:author="Ewa Retajczyk" w:date="2026-10-20T16:16:58Z"/>
-          <w:rFonts w:cstheme="minorHAnsi"/>
-          <w:sz w:val="22"/>
-          <w:szCs w:val="22"/>
-        </w:rPr>
-      </w:pPr>
-      <w:del w:id="5031" w:author="Ewa Retajczyk" w:date="2026-10-20T16:17:06Z">
+          <w:del w:id="5032" w:author="Ewa Retajczyk" w:date="2026-10-20T16:15:52Z"/>
+          <w:rFonts w:cstheme="minorHAnsi"/>
+          <w:sz w:val="22"/>
+          <w:szCs w:val="22"/>
+        </w:rPr>
+      </w:pPr>
+      <w:del w:id="5031" w:author="Ewa Retajczyk" w:date="2026-10-20T16:16:43Z">
         <w:r>
           <w:rPr>
             <w:rFonts w:cstheme="minorHAnsi"/>
@@ -8107,13 +8107,13 @@
         <w:spacing w:after="0" w:line="276" w:lineRule="auto"/>
         <w:jc w:val="both"/>
         <w:rPr>
-          <w:del w:id="5034" w:author="Ewa Retajczyk" w:date="2026-10-20T16:17:20Z"/>
-          <w:rFonts w:cstheme="minorHAnsi"/>
-          <w:sz w:val="22"/>
-          <w:szCs w:val="22"/>
-        </w:rPr>
-      </w:pPr>
-      <w:del w:id="5033" w:author="Ewa Retajczyk" w:date="2026-10-20T16:18:07Z">
+          <w:del w:id="5034" w:author="Ewa Retajczyk" w:date="2026-10-20T16:16:58Z"/>
+          <w:rFonts w:cstheme="minorHAnsi"/>
+          <w:sz w:val="22"/>
+          <w:szCs w:val="22"/>
+        </w:rPr>
+      </w:pPr>
+      <w:del w:id="5033" w:author="Ewa Retajczyk" w:date="2026-10-20T16:17:06Z">
         <w:r>
           <w:rPr>
             <w:rFonts w:cstheme="minorHAnsi"/>
@@ -8133,13 +8133,13 @@
         <w:spacing w:after="0" w:line="276" w:lineRule="auto"/>
         <w:jc w:val="both"/>
         <w:rPr>
-          <w:del w:id="5036" w:author="Ewa Retajczyk" w:date="2026-10-20T16:18:14Z"/>
-          <w:rFonts w:cstheme="minorHAnsi"/>
-          <w:sz w:val="22"/>
-          <w:szCs w:val="22"/>
-        </w:rPr>
-      </w:pPr>
-      <w:del w:id="5035" w:author="Ewa Retajczyk" w:date="2026-10-20T16:18:28Z">
+          <w:del w:id="5036" w:author="Ewa Retajczyk" w:date="2026-10-20T16:17:20Z"/>
+          <w:rFonts w:cstheme="minorHAnsi"/>
+          <w:sz w:val="22"/>
+          <w:szCs w:val="22"/>
+        </w:rPr>
+      </w:pPr>
+      <w:del w:id="5035" w:author="Ewa Retajczyk" w:date="2026-10-20T16:18:07Z">
         <w:r>
           <w:rPr>
             <w:rFonts w:cstheme="minorHAnsi"/>
@@ -8159,13 +8159,13 @@
         <w:spacing w:after="0" w:line="276" w:lineRule="auto"/>
         <w:jc w:val="both"/>
         <w:rPr>
-          <w:del w:id="5038" w:author="Ewa Retajczyk" w:date="2026-10-20T16:18:57Z"/>
-          <w:rFonts w:cstheme="minorHAnsi"/>
-          <w:sz w:val="22"/>
-          <w:szCs w:val="22"/>
-        </w:rPr>
-      </w:pPr>
-      <w:del w:id="5037" w:author="Ewa Retajczyk" w:date="2026-10-20T16:19:33Z">
+          <w:del w:id="5038" w:author="Ewa Retajczyk" w:date="2026-10-20T16:18:14Z"/>
+          <w:rFonts w:cstheme="minorHAnsi"/>
+          <w:sz w:val="22"/>
+          <w:szCs w:val="22"/>
+        </w:rPr>
+      </w:pPr>
+      <w:del w:id="5037" w:author="Ewa Retajczyk" w:date="2026-10-20T16:18:28Z">
         <w:r>
           <w:rPr>
             <w:rFonts w:cstheme="minorHAnsi"/>
@@ -8185,13 +8185,13 @@
         <w:spacing w:after="0" w:line="276" w:lineRule="auto"/>
         <w:jc w:val="both"/>
         <w:rPr>
-          <w:del w:id="5040" w:author="Ewa Retajczyk" w:date="2026-10-20T16:20:17Z"/>
-          <w:rFonts w:cstheme="minorHAnsi"/>
-          <w:sz w:val="22"/>
-          <w:szCs w:val="22"/>
-        </w:rPr>
-      </w:pPr>
-      <w:del w:id="5039" w:author="Ewa Retajczyk" w:date="2026-10-20T16:21:00Z">
+          <w:del w:id="5040" w:author="Ewa Retajczyk" w:date="2026-10-20T16:18:57Z"/>
+          <w:rFonts w:cstheme="minorHAnsi"/>
+          <w:sz w:val="22"/>
+          <w:szCs w:val="22"/>
+        </w:rPr>
+      </w:pPr>
+      <w:del w:id="5039" w:author="Ewa Retajczyk" w:date="2026-10-20T16:19:33Z">
         <w:r>
           <w:rPr>
             <w:rFonts w:cstheme="minorHAnsi"/>
@@ -8211,13 +8211,13 @@
         <w:spacing w:after="0" w:line="276" w:lineRule="auto"/>
         <w:jc w:val="both"/>
         <w:rPr>
-          <w:del w:id="5042" w:author="Ewa Retajczyk" w:date="2026-10-20T16:21:26Z"/>
-          <w:rFonts w:cstheme="minorHAnsi"/>
-          <w:sz w:val="22"/>
-          <w:szCs w:val="22"/>
-        </w:rPr>
-      </w:pPr>
-      <w:del w:id="5041" w:author="Ewa Retajczyk" w:date="2026-10-20T16:21:54Z">
+          <w:del w:id="5042" w:author="Ewa Retajczyk" w:date="2026-10-20T16:20:17Z"/>
+          <w:rFonts w:cstheme="minorHAnsi"/>
+          <w:sz w:val="22"/>
+          <w:szCs w:val="22"/>
+        </w:rPr>
+      </w:pPr>
+      <w:del w:id="5041" w:author="Ewa Retajczyk" w:date="2026-10-20T16:21:00Z">
         <w:r>
           <w:rPr>
             <w:rFonts w:cstheme="minorHAnsi"/>
@@ -8237,13 +8237,13 @@
         <w:spacing w:after="0" w:line="276" w:lineRule="auto"/>
         <w:jc w:val="both"/>
         <w:rPr>
-          <w:del w:id="5044" w:author="Ewa Retajczyk" w:date="2026-10-20T16:22:55Z"/>
-          <w:rFonts w:cstheme="minorHAnsi"/>
-          <w:sz w:val="22"/>
-          <w:szCs w:val="22"/>
-        </w:rPr>
-      </w:pPr>
-      <w:del w:id="5043" w:author="Ewa Retajczyk" w:date="2026-10-20T16:22:58Z">
+          <w:del w:id="5044" w:author="Ewa Retajczyk" w:date="2026-10-20T16:21:26Z"/>
+          <w:rFonts w:cstheme="minorHAnsi"/>
+          <w:sz w:val="22"/>
+          <w:szCs w:val="22"/>
+        </w:rPr>
+      </w:pPr>
+      <w:del w:id="5043" w:author="Ewa Retajczyk" w:date="2026-10-20T16:21:54Z">
         <w:r>
           <w:rPr>
             <w:rFonts w:cstheme="minorHAnsi"/>
@@ -8263,13 +8263,13 @@
         <w:spacing w:after="0" w:line="276" w:lineRule="auto"/>
         <w:jc w:val="both"/>
         <w:rPr>
-          <w:del w:id="5046" w:author="Ewa Retajczyk" w:date="2026-10-20T16:23:05Z"/>
-          <w:rFonts w:cstheme="minorHAnsi"/>
-          <w:sz w:val="22"/>
-          <w:szCs w:val="22"/>
-        </w:rPr>
-      </w:pPr>
-      <w:del w:id="5045" w:author="Ewa Retajczyk" w:date="2026-10-20T16:23:11Z">
+          <w:del w:id="5046" w:author="Ewa Retajczyk" w:date="2026-10-20T16:22:55Z"/>
+          <w:rFonts w:cstheme="minorHAnsi"/>
+          <w:sz w:val="22"/>
+          <w:szCs w:val="22"/>
+        </w:rPr>
+      </w:pPr>
+      <w:del w:id="5045" w:author="Ewa Retajczyk" w:date="2026-10-20T16:22:58Z">
         <w:r>
           <w:rPr>
             <w:rFonts w:cstheme="minorHAnsi"/>
@@ -8290,7 +8290,7 @@
           <w:szCs w:val="22"/>
         </w:rPr>
       </w:pPr>
-      <w:del w:id="5049" w:author="Ewa Retajczyk" w:date="2026-10-20T16:23:15Z">
+      <w:del w:id="5049" w:author="Ewa Retajczyk" w:date="2026-10-20T16:23:05Z">
         <w:r>
           <w:rPr>
             <w:rFonts w:cstheme="minorHAnsi"/>
@@ -8300,7 +8300,7 @@
           <w:delText xml:space="preserve">Terminy</w:delText>
         </w:r>
       </w:del>
-      <w:ins w:id="5050" w:author="Ewa Retajczyk" w:date="2026-10-20T16:23:25Z">
+      <w:ins w:id="5050" w:author="Ewa Retajczyk" w:date="2026-10-20T16:23:11Z">
         <w:r>
           <w:rPr>
             <w:rFonts w:cstheme="minorHAnsi"/>
@@ -8318,7 +8318,7 @@
         </w:rPr>
         <w:t xml:space="preserve"> </w:t>
       </w:r>
-      <w:del w:id="5051" w:author="Ewa Retajczyk" w:date="2026-10-20T16:23:46Z">
+      <w:del w:id="5051" w:author="Ewa Retajczyk" w:date="2026-10-20T16:23:15Z">
         <w:r>
           <w:rPr>
             <w:rFonts w:cstheme="minorHAnsi"/>
@@ -8328,7 +8328,7 @@
           <w:delText xml:space="preserve">zależne</w:delText>
         </w:r>
       </w:del>
-      <w:ins w:id="5052" w:author="Ewa Retajczyk" w:date="2026-10-20T16:25:05Z">
+      <w:ins w:id="5052" w:author="Ewa Retajczyk" w:date="2026-10-20T16:23:25Z">
         <w:r>
           <w:rPr>
             <w:rFonts w:cstheme="minorHAnsi"/>
@@ -8346,7 +8346,7 @@
         </w:rPr>
         <w:t xml:space="preserve"> </w:t>
       </w:r>
-      <w:del w:id="5053" w:author="Ewa Retajczyk" w:date="2026-10-20T16:25:33Z">
+      <w:del w:id="5053" w:author="Ewa Retajczyk" w:date="2026-10-20T16:23:46Z">
         <w:r>
           <w:rPr>
             <w:rFonts w:cstheme="minorHAnsi"/>
@@ -8356,7 +8356,7 @@
           <w:delText xml:space="preserve">od</w:delText>
         </w:r>
       </w:del>
-      <w:ins w:id="5054" w:author="Ewa Retajczyk" w:date="2026-10-20T16:25:53Z">
+      <w:ins w:id="5054" w:author="Ewa Retajczyk" w:date="2026-10-20T16:25:05Z">
         <w:r>
           <w:rPr>
             <w:rFonts w:cstheme="minorHAnsi"/>
@@ -8374,7 +8374,7 @@
         </w:rPr>
         <w:t xml:space="preserve"> </w:t>
       </w:r>
-      <w:del w:id="5055" w:author="Ewa Retajczyk" w:date="2026-10-20T16:26:02Z">
+      <w:del w:id="5055" w:author="Ewa Retajczyk" w:date="2026-10-20T16:25:33Z">
         <w:r>
           <w:rPr>
             <w:rFonts w:cstheme="minorHAnsi"/>
@@ -8384,7 +8384,7 @@
           <w:delText xml:space="preserve">udostępnienia</w:delText>
         </w:r>
       </w:del>
-      <w:ins w:id="5056" w:author="Ewa Retajczyk" w:date="2026-10-20T16:26:33Z">
+      <w:ins w:id="5056" w:author="Ewa Retajczyk" w:date="2026-10-20T16:25:53Z">
         <w:r>
           <w:rPr>
             <w:rFonts w:cstheme="minorHAnsi"/>
@@ -8402,7 +8402,7 @@
         </w:rPr>
         <w:t xml:space="preserve"> </w:t>
       </w:r>
-      <w:del w:id="5057" w:author="Ewa Retajczyk" w:date="2026-10-20T16:26:43Z">
+      <w:del w:id="5057" w:author="Ewa Retajczyk" w:date="2026-10-20T16:26:02Z">
         <w:r>
           <w:rPr>
             <w:rFonts w:cstheme="minorHAnsi"/>
@@ -8412,7 +8412,7 @@
           <w:delText xml:space="preserve">zasilania,</w:delText>
         </w:r>
       </w:del>
-      <w:ins w:id="5058" w:author="Ewa Retajczyk" w:date="2026-10-20T16:26:44Z">
+      <w:ins w:id="5058" w:author="Ewa Retajczyk" w:date="2026-10-20T16:26:33Z">
         <w:r>
           <w:rPr>
             <w:rFonts w:cstheme="minorHAnsi"/>
@@ -8430,7 +8430,7 @@
         </w:rPr>
         <w:t xml:space="preserve"> </w:t>
       </w:r>
-      <w:del w:id="5059" w:author="Ewa Retajczyk" w:date="2026-10-20T16:27:12Z">
+      <w:del w:id="5059" w:author="Ewa Retajczyk" w:date="2026-10-20T16:26:43Z">
         <w:r>
           <w:rPr>
             <w:rFonts w:cstheme="minorHAnsi"/>
@@ -8440,7 +8440,7 @@
           <w:delText xml:space="preserve">przygotowania stanowisk, wykonania infrastruktury lub przekazania danych przez wykonawców Zamówienia nr 2 i Zamówienia nr 3 należy wskazać odrębnie. Terminy podane przez Wykonawcę muszą</w:delText>
         </w:r>
       </w:del>
-      <w:ins w:id="5060" w:author="Ewa Retajczyk" w:date="2026-10-20T16:27:48Z">
+      <w:ins w:id="5060" w:author="Ewa Retajczyk" w:date="2026-10-20T16:26:44Z">
         <w:r>
           <w:rPr>
             <w:rFonts w:cstheme="minorHAnsi"/>
@@ -8505,8 +8505,36 @@
           <w:sz w:val="22"/>
           <w:szCs w:val="22"/>
         </w:rPr>
-        <w:t xml:space="preserve">Wszystkie trzy zamówienia muszą być realizowane w sposób skoordynowany i umożliwiający zakończenie całej inwestycji, obejmującej wykonanie infrastruktury, dostawę, montaż i uruchomienie stacji ładowania, przeprowadzenie wymaganych testów, usunięcie usterek dotyczących całej ogólnodostępnej stacji ładowania, nie później niż do dnia 31.12.2026 r. </w:t>
-      </w:r>
+        <w:t xml:space="preserve">Wszystkie trzy zamówienia muszą być realizowane w sposób skoordynowany i umożliwiający zakończenie całej inwestycji, obejmującej wykonanie infrastruktury, dostawę, montaż i uruchomienie stacji ładowania, przeprowadzenie wymaganych testów, usunięcie usterek dotyczących całej ogólnodostępnej stacji ładowania, nie później niż do dnia 31.12.2026 r.</w:t>
+      </w:r>
+      <w:ins w:id="5081" w:author="Ewa Retajczyk" w:date="2026-10-20T16:27:12Z">
+        <w:r>
+          <w:rPr>
+            <w:rFonts w:cstheme="minorHAnsi"/>
+            <w:sz w:val="22"/>
+            <w:szCs w:val="22"/>
+          </w:rPr>
+          <w:t xml:space="preserve">  Wniosek</w:t>
+        </w:r>
+      </w:ins>
+      <w:r>
+        <w:rPr>
+          <w:rFonts w:cstheme="minorHAnsi"/>
+          <w:sz w:val="22"/>
+          <w:szCs w:val="22"/>
+        </w:rPr>
+        <w:t xml:space="preserve"> </w:t>
+      </w:r>
+      <w:ins w:id="5082" w:author="Ewa Retajczyk" w:date="2026-10-20T16:27:48Z">
+        <w:r>
+          <w:rPr>
+            <w:rFonts w:cstheme="minorHAnsi"/>
+            <w:sz w:val="22"/>
+            <w:szCs w:val="22"/>
+          </w:rPr>
+          <w:t xml:space="preserve">o badanie techniczne UDT zostanie złożony nie później niż do dnia 31.12.2026 r., a dokument dopuszczający UDT wydaje w terminie do 60 dni od złożenia wniosku.</w:t>
+        </w:r>
+      </w:ins>
     </w:p>
     <w:p>
       <w:pPr>
@@ -17101,24 +17129,7 @@
             <w:sz w:val="22"/>
             <w:szCs w:val="22"/>
           </w:rPr>
-          <w:t xml:space="preserve"> (zaliczka </w:t>
-        </w:r>
-        <w:r>
-          <w:rPr>
-            <w:rFonts w:cstheme="minorHAnsi"/>
-            <w:sz w:val="22"/>
-            <w:szCs w:val="22"/>
-            <w:highlight w:val="yellow"/>
-          </w:rPr>
-          <w:t xml:space="preserve">[30]</w:t>
-        </w:r>
-        <w:r>
-          <w:rPr>
-            <w:rFonts w:cstheme="minorHAnsi"/>
-            <w:sz w:val="22"/>
-            <w:szCs w:val="22"/>
-          </w:rPr>
-          <w:t xml:space="preserve">% wartości pozycji 1 formularza cenowego – stacje ładowania – po złożeniu gwarancji zwrotu zaliczki; pozostała część tej pozycji w terminie 14 dni od dnia dostawy; pozostałe pozycje w transzach po odbiorze każdego z elementów; 3% wynagrodzenia po odbiorze końcowym jako zabezpieczenie należytego wykonania umowy), parametry serwisu gwarancyjnego, termin przekazania danych interfejsowych, podział opłat za badania UDT</w:t>
+          <w:t xml:space="preserve"> (zaliczka 50% wartości pozycji 1 formularza cenowego – stacje ładowania – po złożeniu gwarancji zwrotu zaliczki; pozostała część tej pozycji w terminie 14 dni od dnia dostawy; pozostałe pozycje w transzach po odbiorze każdego z elementów; 3% wynagrodzenia po odbiorze końcowym jako zabezpieczenie należytego wykonania umowy), parametry serwisu gwarancyjnego, termin przekazania danych interfejsowych, podział opłat za badania UDT</w:t>
         </w:r>
       </w:ins>
       <w:r>

</xml_diff>